<commit_message>
ppls to amend survey instrument
note changes concern both first and second excel spreadsheet where some questions / responses are more provided for consideration but not necessarily need to included in final design.
</commit_message>
<xml_diff>
--- a/07_outreach/250605_Just_Transition_The_Union_Effect_shorter.docx
+++ b/07_outreach/250605_Just_Transition_The_Union_Effect_shorter.docx
@@ -49,52 +49,7 @@
           <w:szCs w:val="20"/>
           <w:lang w:val="en-GB"/>
         </w:rPr>
-        <w:t>Just Transition</w:t>
-      </w:r>
-      <w:r>
-        <w:rPr>
-          <w:rFonts w:ascii="Calibri" w:hAnsi="Calibri" w:cs="Calibri"/>
-          <w:b/>
-          <w:bCs/>
-          <w:i/>
-          <w:iCs/>
-          <w:color w:val="890517"/>
-          <w:kern w:val="0"/>
-          <w:sz w:val="20"/>
-          <w:szCs w:val="20"/>
-          <w:lang w:val="en-GB"/>
-        </w:rPr>
-        <w:t xml:space="preserve"> initiatives</w:t>
-      </w:r>
-      <w:r>
-        <w:rPr>
-          <w:rFonts w:ascii="Calibri" w:hAnsi="Calibri" w:cs="Calibri"/>
-          <w:b/>
-          <w:bCs/>
-          <w:i/>
-          <w:iCs/>
-          <w:color w:val="890517"/>
-          <w:kern w:val="0"/>
-          <w:sz w:val="20"/>
-          <w:szCs w:val="20"/>
-          <w:lang w:val="en-GB"/>
-        </w:rPr>
-        <w:t xml:space="preserve"> </w:t>
-      </w:r>
-      <w:r>
-        <w:rPr>
-          <w:rFonts w:ascii="Calibri" w:hAnsi="Calibri" w:cs="Calibri"/>
-          <w:b/>
-          <w:bCs/>
-          <w:i/>
-          <w:iCs/>
-          <w:color w:val="890517"/>
-          <w:kern w:val="0"/>
-          <w:sz w:val="20"/>
-          <w:szCs w:val="20"/>
-          <w:lang w:val="en-GB"/>
-        </w:rPr>
-        <w:t>&amp; political support</w:t>
+        <w:t>Introduction</w:t>
       </w:r>
     </w:p>
     <w:p>

</xml_diff>